<commit_message>
Add collection-creation step, drop "on your radar" section per feedback
Confirmed fact: Источники → Документы requires creating a collection
before uploading a file/directory - added as step 1 across all three
formats (.md, .docx, standalone .html) plus istochniki-dokumenty.md.
Also removed the "На что обратить внимание уже сейчас" section and
the short-answer intro/sidebar box from the client-facing HTML per
requested trims; kept the fuller wording in .md/.docx as the internal
reference copy.
</commit_message>
<xml_diff>
--- a/docs/analysis/instrukciya-rabota-s-rag.docx
+++ b/docs/analysis/instrukciya-rabota-s-rag.docx
@@ -422,28 +422,15 @@
       <w:r>
         <w:rPr>
           <w:rFonts w:ascii="Calibri" w:cs="Calibri" w:eastAsia="Calibri" w:hAnsi="Calibri"/>
-          <w:b/>
-          <w:bCs/>
-          <w:i w:val="false"/>
-          <w:iCs w:val="false"/>
-          <w:color w:val="1A1A1A"/>
-          <w:sz w:val="21"/>
-          <w:szCs w:val="21"/>
-        </w:rPr>
-        <w:t xml:space="preserve">+ Загрузить файл</w:t>
-      </w:r>
-      <w:r>
-        <w:rPr>
-          <w:rFonts w:ascii="Calibri" w:cs="Calibri" w:eastAsia="Calibri" w:hAnsi="Calibri"/>
-          <w:b w:val="false"/>
-          <w:bCs w:val="false"/>
-          <w:i w:val="false"/>
-          <w:iCs w:val="false"/>
-          <w:color w:val="1A1A1A"/>
-          <w:sz w:val="21"/>
-          <w:szCs w:val="21"/>
-        </w:rPr>
-        <w:t xml:space="preserve"> — один документ вручную.</w:t>
+          <w:b w:val="false"/>
+          <w:bCs w:val="false"/>
+          <w:i w:val="false"/>
+          <w:iCs w:val="false"/>
+          <w:color w:val="1A1A1A"/>
+          <w:sz w:val="21"/>
+          <w:szCs w:val="21"/>
+        </w:rPr>
+        <w:t xml:space="preserve">Сначала создать коллекцию (если подходящей ещё нет) — документы загружаются не сами по себе, а именно в неё.</w:t>
       </w:r>
     </w:p>
     <w:p>
@@ -455,6 +442,45 @@
         </w:numPr>
         <w:spacing w:after="100" w:line="280"/>
       </w:pPr>
+      <w:r>
+        <w:rPr>
+          <w:rFonts w:ascii="Calibri" w:cs="Calibri" w:eastAsia="Calibri" w:hAnsi="Calibri"/>
+          <w:b w:val="false"/>
+          <w:bCs w:val="false"/>
+          <w:i w:val="false"/>
+          <w:iCs w:val="false"/>
+          <w:color w:val="1A1A1A"/>
+          <w:sz w:val="21"/>
+          <w:szCs w:val="21"/>
+        </w:rPr>
+        <w:t xml:space="preserve">Дальше загрузка: </w:t>
+      </w:r>
+      <w:r>
+        <w:rPr>
+          <w:rFonts w:ascii="Calibri" w:cs="Calibri" w:eastAsia="Calibri" w:hAnsi="Calibri"/>
+          <w:b/>
+          <w:bCs/>
+          <w:i w:val="false"/>
+          <w:iCs w:val="false"/>
+          <w:color w:val="1A1A1A"/>
+          <w:sz w:val="21"/>
+          <w:szCs w:val="21"/>
+        </w:rPr>
+        <w:t xml:space="preserve">+ Загрузить файл</w:t>
+      </w:r>
+      <w:r>
+        <w:rPr>
+          <w:rFonts w:ascii="Calibri" w:cs="Calibri" w:eastAsia="Calibri" w:hAnsi="Calibri"/>
+          <w:b w:val="false"/>
+          <w:bCs w:val="false"/>
+          <w:i w:val="false"/>
+          <w:iCs w:val="false"/>
+          <w:color w:val="1A1A1A"/>
+          <w:sz w:val="21"/>
+          <w:szCs w:val="21"/>
+        </w:rPr>
+        <w:t xml:space="preserve"> — один документ вручную, или </w:t>
+      </w:r>
       <w:r>
         <w:rPr>
           <w:rFonts w:ascii="Calibri" w:cs="Calibri" w:eastAsia="Calibri" w:hAnsi="Calibri"/>
@@ -995,118 +1021,6 @@
           <w:szCs w:val="21"/>
         </w:rPr>
         <w:t xml:space="preserve">Готовый ответ можно сразу экспортировать в PDF или сохранить как шаблон прямо из чата.</w:t>
-      </w:r>
-    </w:p>
-    <w:p>
-      <w:pPr>
-        <w:pStyle w:val="Heading1"/>
-        <w:spacing w:after="120" w:before="320"/>
-      </w:pPr>
-      <w:r>
-        <w:rPr>
-          <w:rFonts w:ascii="Calibri" w:cs="Calibri" w:eastAsia="Calibri" w:hAnsi="Calibri"/>
-          <w:b/>
-          <w:bCs/>
-          <w:color w:val="14181F"/>
-          <w:sz w:val="25"/>
-          <w:szCs w:val="25"/>
-        </w:rPr>
-        <w:t xml:space="preserve">6. На что обратить внимание уже сейчас</w:t>
-      </w:r>
-    </w:p>
-    <w:p>
-      <w:pPr>
-        <w:pStyle w:val="ListParagraph"/>
-        <w:numPr>
-          <w:ilvl w:val="0"/>
-          <w:numId w:val="2"/>
-        </w:numPr>
-        <w:spacing w:after="100" w:line="280"/>
-      </w:pPr>
-      <w:r>
-        <w:rPr>
-          <w:rFonts w:ascii="Calibri" w:cs="Calibri" w:eastAsia="Calibri" w:hAnsi="Calibri"/>
-          <w:b w:val="false"/>
-          <w:bCs w:val="false"/>
-          <w:i w:val="false"/>
-          <w:iCs w:val="false"/>
-          <w:color w:val="1A1A1A"/>
-          <w:sz w:val="21"/>
-          <w:szCs w:val="21"/>
-        </w:rPr>
-        <w:t xml:space="preserve">Чувствительные данные не покидают периметр в незащищённом виде: вызовы во внешние модели (например </w:t>
-      </w:r>
-      <w:r>
-        <w:rPr>
-          <w:rFonts w:ascii="Consolas" w:cs="Consolas" w:eastAsia="Consolas" w:hAnsi="Consolas"/>
-          <w:b w:val="false"/>
-          <w:bCs w:val="false"/>
-          <w:i w:val="false"/>
-          <w:iCs w:val="false"/>
-          <w:color w:val="1A1A1A"/>
-          <w:sz w:val="19"/>
-          <w:szCs w:val="19"/>
-        </w:rPr>
-        <w:t xml:space="preserve">OpenAI/gpt-5.4</w:t>
-      </w:r>
-      <w:r>
-        <w:rPr>
-          <w:rFonts w:ascii="Calibri" w:cs="Calibri" w:eastAsia="Calibri" w:hAnsi="Calibri"/>
-          <w:b w:val="false"/>
-          <w:bCs w:val="false"/>
-          <w:i w:val="false"/>
-          <w:iCs w:val="false"/>
-          <w:color w:val="1A1A1A"/>
-          <w:sz w:val="21"/>
-          <w:szCs w:val="21"/>
-        </w:rPr>
-        <w:t xml:space="preserve">) идут через AI Guard, ПДн и реквизиты маскируются на лету перед отправкой и восстанавливаются только в ответе внутри контура — подробнее в docs/platform/chat.md.</w:t>
-      </w:r>
-    </w:p>
-    <w:p>
-      <w:pPr>
-        <w:pStyle w:val="ListParagraph"/>
-        <w:numPr>
-          <w:ilvl w:val="0"/>
-          <w:numId w:val="2"/>
-        </w:numPr>
-        <w:spacing w:after="100" w:line="280"/>
-      </w:pPr>
-      <w:r>
-        <w:rPr>
-          <w:rFonts w:ascii="Calibri" w:cs="Calibri" w:eastAsia="Calibri" w:hAnsi="Calibri"/>
-          <w:b w:val="false"/>
-          <w:bCs w:val="false"/>
-          <w:i w:val="false"/>
-          <w:iCs w:val="false"/>
-          <w:color w:val="1A1A1A"/>
-          <w:sz w:val="21"/>
-          <w:szCs w:val="21"/>
-        </w:rPr>
-        <w:t xml:space="preserve">«Отладка сессий» (детальный разбор диалога по инструментам/плану) в текущем окружении не подключена — Аудит-БД не сконфигурирована, разбор конкретных ответов пока приходится делать вручную.</w:t>
-      </w:r>
-    </w:p>
-    <w:p>
-      <w:pPr>
-        <w:pStyle w:val="ListParagraph"/>
-        <w:numPr>
-          <w:ilvl w:val="0"/>
-          <w:numId w:val="2"/>
-        </w:numPr>
-        <w:spacing w:after="100" w:line="280"/>
-      </w:pPr>
-      <w:r>
-        <w:rPr>
-          <w:rFonts w:ascii="Calibri" w:cs="Calibri" w:eastAsia="Calibri" w:hAnsi="Calibri"/>
-          <w:b w:val="false"/>
-          <w:bCs w:val="false"/>
-          <w:i w:val="false"/>
-          <w:iCs w:val="false"/>
-          <w:color w:val="1A1A1A"/>
-          <w:sz w:val="21"/>
-          <w:szCs w:val="21"/>
-        </w:rPr>
-        <w:t xml:space="preserve">Несколько открытых вопросов и мелких замечаний по интерфейсу уже зафиксированы отдельно и переданы команде платформы — docs/platform/otkrytye-voprosy.md и voprosy-otvety-tablica.docx.</w:t>
       </w:r>
     </w:p>
     <w:p>

</xml_diff>

<commit_message>
Correct: collection is optional, "Личные документы" skips it entirely
Screenshot of the actual upload modal shows a Назначение field with
two options - "В коллекцию" (needs a collection) and "Личные
документы" (default, no collection needed - goes to personal uploads
space, access controlled by visibility instead of collection
membership). Updated istochniki-dokumenty.md and all three RAG
instruction formats to reflect this instead of the earlier
"collection required first" claim.
</commit_message>
<xml_diff>
--- a/docs/analysis/instrukciya-rabota-s-rag.docx
+++ b/docs/analysis/instrukciya-rabota-s-rag.docx
@@ -422,15 +422,54 @@
       <w:r>
         <w:rPr>
           <w:rFonts w:ascii="Calibri" w:cs="Calibri" w:eastAsia="Calibri" w:hAnsi="Calibri"/>
-          <w:b w:val="false"/>
-          <w:bCs w:val="false"/>
-          <w:i w:val="false"/>
-          <w:iCs w:val="false"/>
-          <w:color w:val="1A1A1A"/>
-          <w:sz w:val="21"/>
-          <w:szCs w:val="21"/>
-        </w:rPr>
-        <w:t xml:space="preserve">Сначала создать коллекцию (если подходящей ещё нет) — документы загружаются не сами по себе, а именно в неё.</w:t>
+          <w:b/>
+          <w:bCs/>
+          <w:i w:val="false"/>
+          <w:iCs w:val="false"/>
+          <w:color w:val="1A1A1A"/>
+          <w:sz w:val="21"/>
+          <w:szCs w:val="21"/>
+        </w:rPr>
+        <w:t xml:space="preserve">+ Загрузить файл</w:t>
+      </w:r>
+      <w:r>
+        <w:rPr>
+          <w:rFonts w:ascii="Calibri" w:cs="Calibri" w:eastAsia="Calibri" w:hAnsi="Calibri"/>
+          <w:b w:val="false"/>
+          <w:bCs w:val="false"/>
+          <w:i w:val="false"/>
+          <w:iCs w:val="false"/>
+          <w:color w:val="1A1A1A"/>
+          <w:sz w:val="21"/>
+          <w:szCs w:val="21"/>
+        </w:rPr>
+        <w:t xml:space="preserve"> — один документ вручную, или </w:t>
+      </w:r>
+      <w:r>
+        <w:rPr>
+          <w:rFonts w:ascii="Calibri" w:cs="Calibri" w:eastAsia="Calibri" w:hAnsi="Calibri"/>
+          <w:b/>
+          <w:bCs/>
+          <w:i w:val="false"/>
+          <w:iCs w:val="false"/>
+          <w:color w:val="1A1A1A"/>
+          <w:sz w:val="21"/>
+          <w:szCs w:val="21"/>
+        </w:rPr>
+        <w:t xml:space="preserve">+ Директорию</w:t>
+      </w:r>
+      <w:r>
+        <w:rPr>
+          <w:rFonts w:ascii="Calibri" w:cs="Calibri" w:eastAsia="Calibri" w:hAnsi="Calibri"/>
+          <w:b w:val="false"/>
+          <w:bCs w:val="false"/>
+          <w:i w:val="false"/>
+          <w:iCs w:val="false"/>
+          <w:color w:val="1A1A1A"/>
+          <w:sz w:val="21"/>
+          <w:szCs w:val="21"/>
+        </w:rPr>
+        <w:t xml:space="preserve"> — целая папка сразу, с пакетной загрузкой и синхронизацией.</w:t>
       </w:r>
     </w:p>
     <w:p>
@@ -453,59 +492,33 @@
           <w:sz w:val="21"/>
           <w:szCs w:val="21"/>
         </w:rPr>
-        <w:t xml:space="preserve">Дальше загрузка: </w:t>
-      </w:r>
-      <w:r>
-        <w:rPr>
-          <w:rFonts w:ascii="Calibri" w:cs="Calibri" w:eastAsia="Calibri" w:hAnsi="Calibri"/>
-          <w:b/>
-          <w:bCs/>
-          <w:i w:val="false"/>
-          <w:iCs w:val="false"/>
-          <w:color w:val="1A1A1A"/>
-          <w:sz w:val="21"/>
-          <w:szCs w:val="21"/>
-        </w:rPr>
-        <w:t xml:space="preserve">+ Загрузить файл</w:t>
-      </w:r>
-      <w:r>
-        <w:rPr>
-          <w:rFonts w:ascii="Calibri" w:cs="Calibri" w:eastAsia="Calibri" w:hAnsi="Calibri"/>
-          <w:b w:val="false"/>
-          <w:bCs w:val="false"/>
-          <w:i w:val="false"/>
-          <w:iCs w:val="false"/>
-          <w:color w:val="1A1A1A"/>
-          <w:sz w:val="21"/>
-          <w:szCs w:val="21"/>
-        </w:rPr>
-        <w:t xml:space="preserve"> — один документ вручную, или </w:t>
-      </w:r>
-      <w:r>
-        <w:rPr>
-          <w:rFonts w:ascii="Calibri" w:cs="Calibri" w:eastAsia="Calibri" w:hAnsi="Calibri"/>
-          <w:b/>
-          <w:bCs/>
-          <w:i w:val="false"/>
-          <w:iCs w:val="false"/>
-          <w:color w:val="1A1A1A"/>
-          <w:sz w:val="21"/>
-          <w:szCs w:val="21"/>
-        </w:rPr>
-        <w:t xml:space="preserve">+ Директорию</w:t>
-      </w:r>
-      <w:r>
-        <w:rPr>
-          <w:rFonts w:ascii="Calibri" w:cs="Calibri" w:eastAsia="Calibri" w:hAnsi="Calibri"/>
-          <w:b w:val="false"/>
-          <w:bCs w:val="false"/>
-          <w:i w:val="false"/>
-          <w:iCs w:val="false"/>
-          <w:color w:val="1A1A1A"/>
-          <w:sz w:val="21"/>
-          <w:szCs w:val="21"/>
-        </w:rPr>
-        <w:t xml:space="preserve"> — целая папка сразу, с пакетной загрузкой и синхронизацией.</w:t>
+        <w:t xml:space="preserve">В форме загрузки — поле «Назначение»: «В коллекцию» (нужно заранее создать коллекцию, если подходящей ещё нет) или «Личные документы» (по умолчанию, без коллекции — файл уходит в личное пространство </w:t>
+      </w:r>
+      <w:r>
+        <w:rPr>
+          <w:rFonts w:ascii="Consolas" w:cs="Consolas" w:eastAsia="Consolas" w:hAnsi="Consolas"/>
+          <w:b w:val="false"/>
+          <w:bCs w:val="false"/>
+          <w:i w:val="false"/>
+          <w:iCs w:val="false"/>
+          <w:color w:val="1A1A1A"/>
+          <w:sz w:val="19"/>
+          <w:szCs w:val="19"/>
+        </w:rPr>
+        <w:t xml:space="preserve">uploads</w:t>
+      </w:r>
+      <w:r>
+        <w:rPr>
+          <w:rFonts w:ascii="Calibri" w:cs="Calibri" w:eastAsia="Calibri" w:hAnsi="Calibri"/>
+          <w:b w:val="false"/>
+          <w:bCs w:val="false"/>
+          <w:i w:val="false"/>
+          <w:iCs w:val="false"/>
+          <w:color w:val="1A1A1A"/>
+          <w:sz w:val="21"/>
+          <w:szCs w:val="21"/>
+        </w:rPr>
+        <w:t xml:space="preserve">, доступ определяется видимостью «Только мне» / «Команде» / «Всем»).</w:t>
       </w:r>
     </w:p>
     <w:p>

</xml_diff>